<commit_message>
Fill in the office address and Hearth as the default lender
306 Jones Avenue, Crawfordsville, IN 47933 now prints in the contract
header and on both Notice of Cancellation copies, and new contracts start
with Hearth as the financing partner. Blank Word copy regenerated.

Co-Authored-By: Claude Opus 5.5 <noreply@anthropic.com>
Claude-Session: https://claude.ai/code/session_014woXYqGRSdAdYEFEpNUqZM
</commit_message>
<xml_diff>
--- a/contracts/Northern-Pines-Home-Improvement-Agreement.docx
+++ b/contracts/Northern-Pines-Home-Improvement-Agreement.docx
@@ -29,9 +29,8 @@
           <w:color w:val="5A5A5A"/>
           <w:sz w:val="17"/>
           <w:szCs w:val="17"/>
-          <w:highlight w:val="yellow"/>
-        </w:rPr>
-        <w:t xml:space="preserve">[STREET ADDRESS]</w:t>
+        </w:rPr>
+        <w:t xml:space="preserve">306 Jones Avenue</w:t>
       </w:r>
       <w:r>
         <w:rPr>
@@ -46,9 +45,8 @@
           <w:color w:val="5A5A5A"/>
           <w:sz w:val="17"/>
           <w:szCs w:val="17"/>
-          <w:highlight w:val="yellow"/>
-        </w:rPr>
-        <w:t xml:space="preserve">[ZIP]</w:t>
+        </w:rPr>
+        <w:t xml:space="preserve">47933</w:t>
       </w:r>
       <w:r>
         <w:rPr>
@@ -4163,9 +4161,8 @@
           <w:bCs/>
           <w:sz w:val="21"/>
           <w:szCs w:val="21"/>
-          <w:highlight w:val="yellow"/>
-        </w:rPr>
-        <w:t xml:space="preserve">[STREET ADDRESS]</w:t>
+        </w:rPr>
+        <w:t xml:space="preserve">306 JONES AVENUE</w:t>
       </w:r>
       <w:r>
         <w:rPr>
@@ -4182,9 +4179,8 @@
           <w:bCs/>
           <w:sz w:val="21"/>
           <w:szCs w:val="21"/>
-          <w:highlight w:val="yellow"/>
-        </w:rPr>
-        <w:t xml:space="preserve">[ZIP]</w:t>
+        </w:rPr>
+        <w:t xml:space="preserve">47933</w:t>
       </w:r>
       <w:r>
         <w:rPr>
@@ -4463,9 +4459,8 @@
           <w:bCs/>
           <w:sz w:val="21"/>
           <w:szCs w:val="21"/>
-          <w:highlight w:val="yellow"/>
-        </w:rPr>
-        <w:t xml:space="preserve">[STREET ADDRESS]</w:t>
+        </w:rPr>
+        <w:t xml:space="preserve">306 JONES AVENUE</w:t>
       </w:r>
       <w:r>
         <w:rPr>
@@ -4482,9 +4477,8 @@
           <w:bCs/>
           <w:sz w:val="21"/>
           <w:szCs w:val="21"/>
-          <w:highlight w:val="yellow"/>
-        </w:rPr>
-        <w:t xml:space="preserve">[ZIP]</w:t>
+        </w:rPr>
+        <w:t xml:space="preserve">47933</w:t>
       </w:r>
       <w:r>
         <w:rPr>

</xml_diff>